<commit_message>
Correct Master's work: fabricated existing pneumatic muscle design, did not build test bench
Co-Authored-By: Claude Opus 5.5 <noreply@anthropic.com>
Claude-Session: https://claude.ai/code/session_01NjdMuB9buEkMmyf7HkyEWg
</commit_message>
<xml_diff>
--- a/applications/Aarhus_University_Lab_Engineer/Arunabha_Majumder_CV_Aarhus_Lab_Engineer.docx
+++ b/applications/Aarhus_University_Lab_Engineer/Arunabha_Majumder_CV_Aarhus_Lab_Engineer.docx
@@ -76,7 +76,7 @@
           <w:b w:val="0"/>
           <w:i w:val="0"/>
         </w:rPr>
-        <w:t>I build experimental setups and keep them running. For the past three years at Aalborg University I have designed test rigs, fitted force, pressure and motion sensors to them, calibrated them against reference sensors and collected data from 12 human participants with EMG and motion capture. Before that I built a pneumatic test bench from scratch in a national lab in India. I enjoy the practical side of research and helping students and colleagues get reliable data out of their experiments.</w:t>
+        <w:t>I build experimental setups and keep them running. For the past three years at Aalborg University I have designed test rigs, fitted force, pressure and motion sensors to them, calibrated them against reference sensors and collected data from 12 human participants with EMG and motion capture. Before that I worked with pneumatic actuators in a national lab in India. I enjoy the practical side of research and helping students and colleagues get reliable data out of their experiments.</w:t>
       </w:r>
     </w:p>
     <w:p>
@@ -137,7 +137,7 @@
         <w:t>0.3-0.78%</w:t>
       </w:r>
       <w:r>
-        <w:t xml:space="preserve"> position error on a pneumatic test bench I built, with a controller in MATLAB/Simulink</w:t>
+        <w:t xml:space="preserve"> position error on a pneumatic muscle with my neural-network controller in MATLAB/Simulink</w:t>
       </w:r>
     </w:p>
     <w:p>
@@ -235,7 +235,7 @@
         <w:rPr>
           <w:b/>
         </w:rPr>
-        <w:t>MTech Researcher, Pneumatic Actuator Test Bench (Master's thesis)</w:t>
+        <w:t>MTech Researcher, Pneumatic Artificial Muscles (Master's thesis)</w:t>
       </w:r>
       <w:r>
         <w:t xml:space="preserve"> | 2020 - 2022</w:t>
@@ -259,7 +259,7 @@
         <w:spacing w:after="40"/>
       </w:pPr>
       <w:r>
-        <w:t>Built a test bench from the ground up with proportional valves, pressure sensors and DAQ, made the pneumatic muscles by hand and measured their load-displacement behaviour.</w:t>
+        <w:t>Fabricated and assembled pneumatic artificial muscles to an existing lab design, and ran experiments on the lab's setup with valves, pressure sensors and DAQ.</w:t>
       </w:r>
     </w:p>
     <w:p>
@@ -268,7 +268,7 @@
         <w:spacing w:after="40"/>
       </w:pPr>
       <w:r>
-        <w:t>Brought position error down to 0.3-0.78%, better than a standard PID, with a neural-network gain-scheduled controller in MATLAB/Simulink running on the bench (IEEE CONECCT 2022).</w:t>
+        <w:t>Brought position error down to 0.3-0.78%, better than a standard PID, with a neural-network gain-scheduled controller that I developed in MATLAB/Simulink (IEEE CONECCT 2022).</w:t>
       </w:r>
     </w:p>
     <w:p>

</xml_diff>

<commit_message>
Correct Master's controller role: outer PID loop and data; neural network was not his
Co-Authored-By: Claude Opus 5.5 <noreply@anthropic.com>
Claude-Session: https://claude.ai/code/session_01NjdMuB9buEkMmyf7HkyEWg
</commit_message>
<xml_diff>
--- a/applications/Aarhus_University_Lab_Engineer/Arunabha_Majumder_CV_Aarhus_Lab_Engineer.docx
+++ b/applications/Aarhus_University_Lab_Engineer/Arunabha_Majumder_CV_Aarhus_Lab_Engineer.docx
@@ -137,7 +137,7 @@
         <w:t>0.3-0.78%</w:t>
       </w:r>
       <w:r>
-        <w:t xml:space="preserve"> position error on a pneumatic muscle with my neural-network controller in MATLAB/Simulink</w:t>
+        <w:t xml:space="preserve"> position error on a pneumatic muscle with the gain-scheduled PID controller I worked on</w:t>
       </w:r>
     </w:p>
     <w:p>
@@ -268,7 +268,7 @@
         <w:spacing w:after="40"/>
       </w:pPr>
       <w:r>
-        <w:t>Brought position error down to 0.3-0.78%, better than a standard PID, with a neural-network gain-scheduled controller that I developed in MATLAB/Simulink (IEEE CONECCT 2022).</w:t>
+        <w:t>Brought position error down to 0.3-0.78%, better than a standard PID, by working on the outer PID loop of a neural-network gain-scheduled controller in MATLAB/Simulink. I collected the experimental data, fed it to the lab's existing neural network and used its output to set the PID gains (IEEE CONECCT 2022).</w:t>
       </w:r>
     </w:p>
     <w:p>

</xml_diff>